<commit_message>
Finalize hackathon submission cleanup
</commit_message>
<xml_diff>
--- a/docs/evidence/DecisionReady_Hackathon_Evidence.docx
+++ b/docs/evidence/DecisionReady_Hackathon_Evidence.docx
@@ -1425,7 +1425,7 @@
                 <w:b w:val="0"/>
                 <w:sz w:val="19"/>
               </w:rPr>
-              <w:t>README.md replacement in this submission pack</w:t>
+              <w:t>README.md in public repository</w:t>
             </w:r>
           </w:p>
         </w:tc>
@@ -1639,17 +1639,10 @@
     <w:p>
       <w:pPr>
         <w:pStyle w:val="Heading1"/>
+        <w:pageBreakBefore/>
       </w:pPr>
       <w:r>
-        <w:t>8. Final Submission Gaps</w:t>
-      </w:r>
-    </w:p>
-    <w:p>
-      <w:pPr>
-        <w:pStyle w:val="ListBullet"/>
-      </w:pPr>
-      <w:r>
-        <w:t>Update the public repo README and architecture document with the submission-ready versions in this pack.</w:t>
+        <w:t>8. Remaining Submission Actions</w:t>
       </w:r>
     </w:p>
     <w:p>

</xml_diff>